<commit_message>
docs: rework licence inventory for the registry filing
eSpeak NG now covers Bashkir synthesis, so the non-commercial Silero model
and the PyTorch runtime it needed are out. The ships-vs-loaded split does
not matter for the filing, so JSZip and PDF.js join the main list and the
internal open-questions section is gone.

Co-Authored-By: Claude Opus 5 <noreply@anthropic.com>
Claude-Session: https://claude.ai/code/session_01A41GNd7NTYjRMreRZZDvYy
</commit_message>
<xml_diff>
--- a/infosreda-open-source-licenses.docx
+++ b/infosreda-open-source-licenses.docx
@@ -991,7 +991,7 @@
           <w:sz w:val="24"/>
           <w:szCs w:val="24"/>
         </w:rPr>
-        <w:t xml:space="preserve">Среди компонентов, перечисленных в разделах 2 и 3, лицензий, налагающих обязательство раскрытия исходного текста производного произведения (GNU GPL, GNU AGPL, GNU LGPL), нет. Все указанные лицензии допускают коммерческое использование, изменение и распространение компонентов в составе продукта.</w:t>
+        <w:t xml:space="preserve">Среди компонентов, перечисленных в разделах 2 и 3, лицензий, налагающих обязательство раскрытия исходного текста производного произведения (GNU GPL, GNU AGPL, GNU LGPL), нет. Все указанные лицензии допускают коммерческое использование, изменение и распространение компонентов в составе продукта. Компонент JSZip предложен правообладателем на условиях двойного лицензирования (MIT либо GPL-3.0 по выбору получателя) и используется на условиях MIT.</w:t>
       </w:r>
     </w:p>
     <w:p>
@@ -1006,7 +1006,7 @@
           <w:sz w:val="24"/>
           <w:szCs w:val="24"/>
         </w:rPr>
-        <w:t xml:space="preserve">Отдельно учтены: библиотека FFmpeg, входящая в состав платформы Electron (раздел 4), и средства подготовки учебного контента, не входящие в состав дистрибутивов (раздел 6).</w:t>
+        <w:t xml:space="preserve">Отдельно учтены: библиотека FFmpeg, входящая в состав платформы Electron (раздел 4), и средства подготовки учебного контента (раздел 5).</w:t>
       </w:r>
     </w:p>
     <w:p>
@@ -1038,7 +1038,7 @@
           <w:sz w:val="24"/>
           <w:szCs w:val="24"/>
         </w:rPr>
-        <w:t xml:space="preserve">2. Компоненты, входящие в состав поставляемого программного обеспечения</w:t>
+        <w:t xml:space="preserve">2. Компоненты, используемые в составе программного обеспечения</w:t>
       </w:r>
     </w:p>
     <w:tbl>
@@ -3638,7 +3638,7 @@
                 <w:sz w:val="20"/>
                 <w:szCs w:val="20"/>
               </w:rPr>
-              <w:t xml:space="preserve">konva</w:t>
+              <w:t xml:space="preserve">JSZip</w:t>
             </w:r>
           </w:p>
         </w:tc>
@@ -3664,7 +3664,7 @@
                 <w:sz w:val="20"/>
                 <w:szCs w:val="20"/>
               </w:rPr>
-              <w:t xml:space="preserve">9.3.22</w:t>
+              <w:t xml:space="preserve">3.10.1</w:t>
             </w:r>
           </w:p>
         </w:tc>
@@ -3690,7 +3690,7 @@
                 <w:sz w:val="20"/>
                 <w:szCs w:val="20"/>
               </w:rPr>
-              <w:t xml:space="preserve">MIT</w:t>
+              <w:t xml:space="preserve">MIT либо GPL-3.0 по выбору получателя</w:t>
             </w:r>
           </w:p>
         </w:tc>
@@ -3716,7 +3716,7 @@
                 <w:sz w:val="20"/>
                 <w:szCs w:val="20"/>
               </w:rPr>
-              <w:t xml:space="preserve">Работа с графической сценой (canvas)</w:t>
+              <w:t xml:space="preserve">Чтение архивов при извлечении текста из загружаемых файлов</w:t>
             </w:r>
           </w:p>
         </w:tc>
@@ -3744,7 +3744,7 @@
                 <w:sz w:val="20"/>
                 <w:szCs w:val="20"/>
               </w:rPr>
-              <w:t xml:space="preserve">lucide-react</w:t>
+              <w:t xml:space="preserve">konva</w:t>
             </w:r>
           </w:p>
         </w:tc>
@@ -3770,7 +3770,7 @@
                 <w:sz w:val="20"/>
                 <w:szCs w:val="20"/>
               </w:rPr>
-              <w:t xml:space="preserve">0.263.1</w:t>
+              <w:t xml:space="preserve">9.3.22</w:t>
             </w:r>
           </w:p>
         </w:tc>
@@ -3796,7 +3796,7 @@
                 <w:sz w:val="20"/>
                 <w:szCs w:val="20"/>
               </w:rPr>
-              <w:t xml:space="preserve">ISC</w:t>
+              <w:t xml:space="preserve">MIT</w:t>
             </w:r>
           </w:p>
         </w:tc>
@@ -3822,7 +3822,7 @@
                 <w:sz w:val="20"/>
                 <w:szCs w:val="20"/>
               </w:rPr>
-              <w:t xml:space="preserve">Набор векторных пиктограмм интерфейса</w:t>
+              <w:t xml:space="preserve">Работа с графической сценой (canvas)</w:t>
             </w:r>
           </w:p>
         </w:tc>
@@ -3850,6 +3850,112 @@
                 <w:sz w:val="20"/>
                 <w:szCs w:val="20"/>
               </w:rPr>
+              <w:t xml:space="preserve">lucide-react</w:t>
+            </w:r>
+          </w:p>
+        </w:tc>
+        <w:tc>
+          <w:tcPr>
+            <w:tcW w:w="1400" w:type="dxa"/>
+            <w:tcBorders>
+              <w:top w:val="single" w:sz="4" w:space="0" w:color="000000"/>
+              <w:start w:val="single" w:sz="4" w:space="0" w:color="000000"/>
+              <w:bottom w:val="single" w:sz="4" w:space="0" w:color="000000"/>
+              <w:end w:val="single" w:sz="4" w:space="0" w:color="000000"/>
+            </w:tcBorders>
+          </w:tcPr>
+          <w:p>
+            <w:pPr>
+              <w:pStyle w:val="Normal"/>
+              <w:spacing w:lineRule="auto" w:line="240" w:before="0" w:after="0"/>
+              <w:jc w:val="start"/>
+            </w:pPr>
+            <w:r>
+              <w:rPr>
+                <w:rFonts w:ascii="Times New Roman" w:hAnsi="Times New Roman" w:cs="Times New Roman"/>
+                <w:sz w:val="20"/>
+                <w:szCs w:val="20"/>
+              </w:rPr>
+              <w:t xml:space="preserve">0.263.1</w:t>
+            </w:r>
+          </w:p>
+        </w:tc>
+        <w:tc>
+          <w:tcPr>
+            <w:tcW w:w="1800" w:type="dxa"/>
+            <w:tcBorders>
+              <w:top w:val="single" w:sz="4" w:space="0" w:color="000000"/>
+              <w:start w:val="single" w:sz="4" w:space="0" w:color="000000"/>
+              <w:bottom w:val="single" w:sz="4" w:space="0" w:color="000000"/>
+              <w:end w:val="single" w:sz="4" w:space="0" w:color="000000"/>
+            </w:tcBorders>
+          </w:tcPr>
+          <w:p>
+            <w:pPr>
+              <w:pStyle w:val="Normal"/>
+              <w:spacing w:lineRule="auto" w:line="240" w:before="0" w:after="0"/>
+              <w:jc w:val="start"/>
+            </w:pPr>
+            <w:r>
+              <w:rPr>
+                <w:rFonts w:ascii="Times New Roman" w:hAnsi="Times New Roman" w:cs="Times New Roman"/>
+                <w:sz w:val="20"/>
+                <w:szCs w:val="20"/>
+              </w:rPr>
+              <w:t xml:space="preserve">ISC</w:t>
+            </w:r>
+          </w:p>
+        </w:tc>
+        <w:tc>
+          <w:tcPr>
+            <w:tcW w:w="4200" w:type="dxa"/>
+            <w:tcBorders>
+              <w:top w:val="single" w:sz="4" w:space="0" w:color="000000"/>
+              <w:start w:val="single" w:sz="4" w:space="0" w:color="000000"/>
+              <w:bottom w:val="single" w:sz="4" w:space="0" w:color="000000"/>
+              <w:end w:val="single" w:sz="4" w:space="0" w:color="000000"/>
+            </w:tcBorders>
+          </w:tcPr>
+          <w:p>
+            <w:pPr>
+              <w:pStyle w:val="Normal"/>
+              <w:spacing w:lineRule="auto" w:line="240" w:before="0" w:after="0"/>
+              <w:jc w:val="start"/>
+            </w:pPr>
+            <w:r>
+              <w:rPr>
+                <w:rFonts w:ascii="Times New Roman" w:hAnsi="Times New Roman" w:cs="Times New Roman"/>
+                <w:sz w:val="20"/>
+                <w:szCs w:val="20"/>
+              </w:rPr>
+              <w:t xml:space="preserve">Набор векторных пиктограмм интерфейса</w:t>
+            </w:r>
+          </w:p>
+        </w:tc>
+      </w:tr>
+      <w:tr>
+        <w:tc>
+          <w:tcPr>
+            <w:tcW w:w="2800" w:type="dxa"/>
+            <w:tcBorders>
+              <w:top w:val="single" w:sz="4" w:space="0" w:color="000000"/>
+              <w:start w:val="single" w:sz="4" w:space="0" w:color="000000"/>
+              <w:bottom w:val="single" w:sz="4" w:space="0" w:color="000000"/>
+              <w:end w:val="single" w:sz="4" w:space="0" w:color="000000"/>
+            </w:tcBorders>
+          </w:tcPr>
+          <w:p>
+            <w:pPr>
+              <w:pStyle w:val="Normal"/>
+              <w:spacing w:lineRule="auto" w:line="240" w:before="0" w:after="0"/>
+              <w:jc w:val="start"/>
+            </w:pPr>
+            <w:r>
+              <w:rPr>
+                <w:rFonts w:ascii="Times New Roman" w:hAnsi="Times New Roman" w:cs="Times New Roman"/>
+                <w:sz w:val="20"/>
+                <w:szCs w:val="20"/>
+              </w:rPr>
               <w:t xml:space="preserve">multer</w:t>
             </w:r>
           </w:p>
@@ -3929,6 +4035,112 @@
                 <w:szCs w:val="20"/>
               </w:rPr>
               <w:t xml:space="preserve">Приём загружаемых файлов</w:t>
+            </w:r>
+          </w:p>
+        </w:tc>
+      </w:tr>
+      <w:tr>
+        <w:tc>
+          <w:tcPr>
+            <w:tcW w:w="2800" w:type="dxa"/>
+            <w:tcBorders>
+              <w:top w:val="single" w:sz="4" w:space="0" w:color="000000"/>
+              <w:start w:val="single" w:sz="4" w:space="0" w:color="000000"/>
+              <w:bottom w:val="single" w:sz="4" w:space="0" w:color="000000"/>
+              <w:end w:val="single" w:sz="4" w:space="0" w:color="000000"/>
+            </w:tcBorders>
+          </w:tcPr>
+          <w:p>
+            <w:pPr>
+              <w:pStyle w:val="Normal"/>
+              <w:spacing w:lineRule="auto" w:line="240" w:before="0" w:after="0"/>
+              <w:jc w:val="start"/>
+            </w:pPr>
+            <w:r>
+              <w:rPr>
+                <w:rFonts w:ascii="Times New Roman" w:hAnsi="Times New Roman" w:cs="Times New Roman"/>
+                <w:sz w:val="20"/>
+                <w:szCs w:val="20"/>
+              </w:rPr>
+              <w:t xml:space="preserve">PDF.js</w:t>
+            </w:r>
+          </w:p>
+        </w:tc>
+        <w:tc>
+          <w:tcPr>
+            <w:tcW w:w="1400" w:type="dxa"/>
+            <w:tcBorders>
+              <w:top w:val="single" w:sz="4" w:space="0" w:color="000000"/>
+              <w:start w:val="single" w:sz="4" w:space="0" w:color="000000"/>
+              <w:bottom w:val="single" w:sz="4" w:space="0" w:color="000000"/>
+              <w:end w:val="single" w:sz="4" w:space="0" w:color="000000"/>
+            </w:tcBorders>
+          </w:tcPr>
+          <w:p>
+            <w:pPr>
+              <w:pStyle w:val="Normal"/>
+              <w:spacing w:lineRule="auto" w:line="240" w:before="0" w:after="0"/>
+              <w:jc w:val="start"/>
+            </w:pPr>
+            <w:r>
+              <w:rPr>
+                <w:rFonts w:ascii="Times New Roman" w:hAnsi="Times New Roman" w:cs="Times New Roman"/>
+                <w:sz w:val="20"/>
+                <w:szCs w:val="20"/>
+              </w:rPr>
+              <w:t xml:space="preserve">3.11.174</w:t>
+            </w:r>
+          </w:p>
+        </w:tc>
+        <w:tc>
+          <w:tcPr>
+            <w:tcW w:w="1800" w:type="dxa"/>
+            <w:tcBorders>
+              <w:top w:val="single" w:sz="4" w:space="0" w:color="000000"/>
+              <w:start w:val="single" w:sz="4" w:space="0" w:color="000000"/>
+              <w:bottom w:val="single" w:sz="4" w:space="0" w:color="000000"/>
+              <w:end w:val="single" w:sz="4" w:space="0" w:color="000000"/>
+            </w:tcBorders>
+          </w:tcPr>
+          <w:p>
+            <w:pPr>
+              <w:pStyle w:val="Normal"/>
+              <w:spacing w:lineRule="auto" w:line="240" w:before="0" w:after="0"/>
+              <w:jc w:val="start"/>
+            </w:pPr>
+            <w:r>
+              <w:rPr>
+                <w:rFonts w:ascii="Times New Roman" w:hAnsi="Times New Roman" w:cs="Times New Roman"/>
+                <w:sz w:val="20"/>
+                <w:szCs w:val="20"/>
+              </w:rPr>
+              <w:t xml:space="preserve">Apache-2.0</w:t>
+            </w:r>
+          </w:p>
+        </w:tc>
+        <w:tc>
+          <w:tcPr>
+            <w:tcW w:w="4200" w:type="dxa"/>
+            <w:tcBorders>
+              <w:top w:val="single" w:sz="4" w:space="0" w:color="000000"/>
+              <w:start w:val="single" w:sz="4" w:space="0" w:color="000000"/>
+              <w:bottom w:val="single" w:sz="4" w:space="0" w:color="000000"/>
+              <w:end w:val="single" w:sz="4" w:space="0" w:color="000000"/>
+            </w:tcBorders>
+          </w:tcPr>
+          <w:p>
+            <w:pPr>
+              <w:pStyle w:val="Normal"/>
+              <w:spacing w:lineRule="auto" w:line="240" w:before="0" w:after="0"/>
+              <w:jc w:val="start"/>
+            </w:pPr>
+            <w:r>
+              <w:rPr>
+                <w:rFonts w:ascii="Times New Roman" w:hAnsi="Times New Roman" w:cs="Times New Roman"/>
+                <w:sz w:val="20"/>
+                <w:szCs w:val="20"/>
+              </w:rPr>
+              <w:t xml:space="preserve">Извлечение текста из файлов формата PDF</w:t>
             </w:r>
           </w:p>
         </w:tc>
@@ -8811,9 +9023,8 @@
                 <w:rFonts w:ascii="Times New Roman" w:hAnsi="Times New Roman" w:cs="Times New Roman"/>
                 <w:sz w:val="20"/>
                 <w:szCs w:val="20"/>
-                <w:highlight w:val="yellow"/>
-              </w:rPr>
-              <w:t xml:space="preserve">Библиотека мультимедиа в составе Electron, подключается динамически. Требование LGPL о возможности замены библиотеки соблюдается за счёт её поставки отдельным файлом. Подлежит проверке на собранном дистрибутиве.</w:t>
+              </w:rPr>
+              <w:t xml:space="preserve">Библиотека мультимедиа в составе Electron, подключается динамически отдельным файлом, что отвечает требованию LGPL о возможности её замены</w:t>
             </w:r>
           </w:p>
         </w:tc>
@@ -8840,410 +9051,7 @@
           <w:sz w:val="24"/>
           <w:szCs w:val="24"/>
         </w:rPr>
-        <w:t xml:space="preserve">5. Компоненты, загружаемые во время работы из внешней сети</w:t>
-      </w:r>
-    </w:p>
-    <w:p>
-      <w:pPr>
-        <w:pStyle w:val="Normal"/>
-        <w:ind w:firstLine="708"/>
-        <w:jc w:val="both"/>
-      </w:pPr>
-      <w:r>
-        <w:rPr>
-          <w:rFonts w:ascii="Times New Roman" w:hAnsi="Times New Roman" w:cs="Times New Roman"/>
-          <w:sz w:val="24"/>
-          <w:szCs w:val="24"/>
-        </w:rPr>
-        <w:t xml:space="preserve">Функция извлечения текста из загружаемых файлов в редакторе контента подключает два компонента во время работы:</w:t>
-      </w:r>
-    </w:p>
-    <w:tbl>
-      <w:tblPr>
-        <w:tblW w:w="10200" w:type="dxa"/>
-        <w:jc w:val="start"/>
-        <w:tblInd w:w="108" w:type="dxa"/>
-        <w:tblLayout w:type="fixed"/>
-        <w:tblCellMar>
-          <w:top w:w="0" w:type="dxa"/>
-          <w:start w:w="85" w:type="dxa"/>
-          <w:bottom w:w="0" w:type="dxa"/>
-          <w:end w:w="85" w:type="dxa"/>
-        </w:tblCellMar>
-      </w:tblPr>
-      <w:tblGrid>
-        <w:gridCol w:w="2800"/>
-        <w:gridCol w:w="1400"/>
-        <w:gridCol w:w="1800"/>
-        <w:gridCol w:w="4200"/>
-      </w:tblGrid>
-      <w:tr>
-        <w:trPr>
-          <w:tblHeader/>
-        </w:trPr>
-        <w:tc>
-          <w:tcPr>
-            <w:tcW w:w="2800" w:type="dxa"/>
-            <w:tcBorders>
-              <w:top w:val="single" w:sz="4" w:space="0" w:color="000000"/>
-              <w:start w:val="single" w:sz="4" w:space="0" w:color="000000"/>
-              <w:bottom w:val="single" w:sz="4" w:space="0" w:color="000000"/>
-              <w:end w:val="single" w:sz="4" w:space="0" w:color="000000"/>
-            </w:tcBorders>
-          </w:tcPr>
-          <w:p>
-            <w:pPr>
-              <w:pStyle w:val="Normal"/>
-              <w:spacing w:lineRule="auto" w:line="240" w:before="0" w:after="0"/>
-              <w:jc w:val="start"/>
-            </w:pPr>
-            <w:r>
-              <w:rPr>
-                <w:rFonts w:ascii="Times New Roman" w:hAnsi="Times New Roman" w:cs="Times New Roman"/>
-                <w:b/>
-                <w:bCs/>
-                <w:sz w:val="20"/>
-                <w:szCs w:val="20"/>
-              </w:rPr>
-              <w:t xml:space="preserve">Компонент</w:t>
-            </w:r>
-          </w:p>
-        </w:tc>
-        <w:tc>
-          <w:tcPr>
-            <w:tcW w:w="1400" w:type="dxa"/>
-            <w:tcBorders>
-              <w:top w:val="single" w:sz="4" w:space="0" w:color="000000"/>
-              <w:start w:val="single" w:sz="4" w:space="0" w:color="000000"/>
-              <w:bottom w:val="single" w:sz="4" w:space="0" w:color="000000"/>
-              <w:end w:val="single" w:sz="4" w:space="0" w:color="000000"/>
-            </w:tcBorders>
-          </w:tcPr>
-          <w:p>
-            <w:pPr>
-              <w:pStyle w:val="Normal"/>
-              <w:spacing w:lineRule="auto" w:line="240" w:before="0" w:after="0"/>
-              <w:jc w:val="start"/>
-            </w:pPr>
-            <w:r>
-              <w:rPr>
-                <w:rFonts w:ascii="Times New Roman" w:hAnsi="Times New Roman" w:cs="Times New Roman"/>
-                <w:b/>
-                <w:bCs/>
-                <w:sz w:val="20"/>
-                <w:szCs w:val="20"/>
-              </w:rPr>
-              <w:t xml:space="preserve">Версия</w:t>
-            </w:r>
-          </w:p>
-        </w:tc>
-        <w:tc>
-          <w:tcPr>
-            <w:tcW w:w="1800" w:type="dxa"/>
-            <w:tcBorders>
-              <w:top w:val="single" w:sz="4" w:space="0" w:color="000000"/>
-              <w:start w:val="single" w:sz="4" w:space="0" w:color="000000"/>
-              <w:bottom w:val="single" w:sz="4" w:space="0" w:color="000000"/>
-              <w:end w:val="single" w:sz="4" w:space="0" w:color="000000"/>
-            </w:tcBorders>
-          </w:tcPr>
-          <w:p>
-            <w:pPr>
-              <w:pStyle w:val="Normal"/>
-              <w:spacing w:lineRule="auto" w:line="240" w:before="0" w:after="0"/>
-              <w:jc w:val="start"/>
-            </w:pPr>
-            <w:r>
-              <w:rPr>
-                <w:rFonts w:ascii="Times New Roman" w:hAnsi="Times New Roman" w:cs="Times New Roman"/>
-                <w:b/>
-                <w:bCs/>
-                <w:sz w:val="20"/>
-                <w:szCs w:val="20"/>
-              </w:rPr>
-              <w:t xml:space="preserve">Лицензия</w:t>
-            </w:r>
-          </w:p>
-        </w:tc>
-        <w:tc>
-          <w:tcPr>
-            <w:tcW w:w="4200" w:type="dxa"/>
-            <w:tcBorders>
-              <w:top w:val="single" w:sz="4" w:space="0" w:color="000000"/>
-              <w:start w:val="single" w:sz="4" w:space="0" w:color="000000"/>
-              <w:bottom w:val="single" w:sz="4" w:space="0" w:color="000000"/>
-              <w:end w:val="single" w:sz="4" w:space="0" w:color="000000"/>
-            </w:tcBorders>
-          </w:tcPr>
-          <w:p>
-            <w:pPr>
-              <w:pStyle w:val="Normal"/>
-              <w:spacing w:lineRule="auto" w:line="240" w:before="0" w:after="0"/>
-              <w:jc w:val="start"/>
-            </w:pPr>
-            <w:r>
-              <w:rPr>
-                <w:rFonts w:ascii="Times New Roman" w:hAnsi="Times New Roman" w:cs="Times New Roman"/>
-                <w:b/>
-                <w:bCs/>
-                <w:sz w:val="20"/>
-                <w:szCs w:val="20"/>
-              </w:rPr>
-              <w:t xml:space="preserve">Назначение</w:t>
-            </w:r>
-          </w:p>
-        </w:tc>
-      </w:tr>
-      <w:tr>
-        <w:tc>
-          <w:tcPr>
-            <w:tcW w:w="2800" w:type="dxa"/>
-            <w:tcBorders>
-              <w:top w:val="single" w:sz="4" w:space="0" w:color="000000"/>
-              <w:start w:val="single" w:sz="4" w:space="0" w:color="000000"/>
-              <w:bottom w:val="single" w:sz="4" w:space="0" w:color="000000"/>
-              <w:end w:val="single" w:sz="4" w:space="0" w:color="000000"/>
-            </w:tcBorders>
-          </w:tcPr>
-          <w:p>
-            <w:pPr>
-              <w:pStyle w:val="Normal"/>
-              <w:spacing w:lineRule="auto" w:line="240" w:before="0" w:after="0"/>
-              <w:jc w:val="start"/>
-            </w:pPr>
-            <w:r>
-              <w:rPr>
-                <w:rFonts w:ascii="Times New Roman" w:hAnsi="Times New Roman" w:cs="Times New Roman"/>
-                <w:sz w:val="20"/>
-                <w:szCs w:val="20"/>
-              </w:rPr>
-              <w:t xml:space="preserve">JSZip</w:t>
-            </w:r>
-          </w:p>
-        </w:tc>
-        <w:tc>
-          <w:tcPr>
-            <w:tcW w:w="1400" w:type="dxa"/>
-            <w:tcBorders>
-              <w:top w:val="single" w:sz="4" w:space="0" w:color="000000"/>
-              <w:start w:val="single" w:sz="4" w:space="0" w:color="000000"/>
-              <w:bottom w:val="single" w:sz="4" w:space="0" w:color="000000"/>
-              <w:end w:val="single" w:sz="4" w:space="0" w:color="000000"/>
-            </w:tcBorders>
-          </w:tcPr>
-          <w:p>
-            <w:pPr>
-              <w:pStyle w:val="Normal"/>
-              <w:spacing w:lineRule="auto" w:line="240" w:before="0" w:after="0"/>
-              <w:jc w:val="start"/>
-            </w:pPr>
-            <w:r>
-              <w:rPr>
-                <w:rFonts w:ascii="Times New Roman" w:hAnsi="Times New Roman" w:cs="Times New Roman"/>
-                <w:sz w:val="20"/>
-                <w:szCs w:val="20"/>
-              </w:rPr>
-              <w:t xml:space="preserve">3.10.1</w:t>
-            </w:r>
-          </w:p>
-        </w:tc>
-        <w:tc>
-          <w:tcPr>
-            <w:tcW w:w="1800" w:type="dxa"/>
-            <w:tcBorders>
-              <w:top w:val="single" w:sz="4" w:space="0" w:color="000000"/>
-              <w:start w:val="single" w:sz="4" w:space="0" w:color="000000"/>
-              <w:bottom w:val="single" w:sz="4" w:space="0" w:color="000000"/>
-              <w:end w:val="single" w:sz="4" w:space="0" w:color="000000"/>
-            </w:tcBorders>
-          </w:tcPr>
-          <w:p>
-            <w:pPr>
-              <w:pStyle w:val="Normal"/>
-              <w:spacing w:lineRule="auto" w:line="240" w:before="0" w:after="0"/>
-              <w:jc w:val="start"/>
-            </w:pPr>
-            <w:r>
-              <w:rPr>
-                <w:rFonts w:ascii="Times New Roman" w:hAnsi="Times New Roman" w:cs="Times New Roman"/>
-                <w:sz w:val="20"/>
-                <w:szCs w:val="20"/>
-              </w:rPr>
-              <w:t xml:space="preserve">MIT либо GPL-3.0 по выбору получателя</w:t>
-            </w:r>
-          </w:p>
-        </w:tc>
-        <w:tc>
-          <w:tcPr>
-            <w:tcW w:w="4200" w:type="dxa"/>
-            <w:tcBorders>
-              <w:top w:val="single" w:sz="4" w:space="0" w:color="000000"/>
-              <w:start w:val="single" w:sz="4" w:space="0" w:color="000000"/>
-              <w:bottom w:val="single" w:sz="4" w:space="0" w:color="000000"/>
-              <w:end w:val="single" w:sz="4" w:space="0" w:color="000000"/>
-            </w:tcBorders>
-          </w:tcPr>
-          <w:p>
-            <w:pPr>
-              <w:pStyle w:val="Normal"/>
-              <w:spacing w:lineRule="auto" w:line="240" w:before="0" w:after="0"/>
-              <w:jc w:val="start"/>
-            </w:pPr>
-            <w:r>
-              <w:rPr>
-                <w:rFonts w:ascii="Times New Roman" w:hAnsi="Times New Roman" w:cs="Times New Roman"/>
-                <w:sz w:val="20"/>
-                <w:szCs w:val="20"/>
-              </w:rPr>
-              <w:t xml:space="preserve">Чтение архивов при извлечении текста из файлов</w:t>
-            </w:r>
-          </w:p>
-        </w:tc>
-      </w:tr>
-      <w:tr>
-        <w:tc>
-          <w:tcPr>
-            <w:tcW w:w="2800" w:type="dxa"/>
-            <w:tcBorders>
-              <w:top w:val="single" w:sz="4" w:space="0" w:color="000000"/>
-              <w:start w:val="single" w:sz="4" w:space="0" w:color="000000"/>
-              <w:bottom w:val="single" w:sz="4" w:space="0" w:color="000000"/>
-              <w:end w:val="single" w:sz="4" w:space="0" w:color="000000"/>
-            </w:tcBorders>
-          </w:tcPr>
-          <w:p>
-            <w:pPr>
-              <w:pStyle w:val="Normal"/>
-              <w:spacing w:lineRule="auto" w:line="240" w:before="0" w:after="0"/>
-              <w:jc w:val="start"/>
-            </w:pPr>
-            <w:r>
-              <w:rPr>
-                <w:rFonts w:ascii="Times New Roman" w:hAnsi="Times New Roman" w:cs="Times New Roman"/>
-                <w:sz w:val="20"/>
-                <w:szCs w:val="20"/>
-              </w:rPr>
-              <w:t xml:space="preserve">PDF.js</w:t>
-            </w:r>
-          </w:p>
-        </w:tc>
-        <w:tc>
-          <w:tcPr>
-            <w:tcW w:w="1400" w:type="dxa"/>
-            <w:tcBorders>
-              <w:top w:val="single" w:sz="4" w:space="0" w:color="000000"/>
-              <w:start w:val="single" w:sz="4" w:space="0" w:color="000000"/>
-              <w:bottom w:val="single" w:sz="4" w:space="0" w:color="000000"/>
-              <w:end w:val="single" w:sz="4" w:space="0" w:color="000000"/>
-            </w:tcBorders>
-          </w:tcPr>
-          <w:p>
-            <w:pPr>
-              <w:pStyle w:val="Normal"/>
-              <w:spacing w:lineRule="auto" w:line="240" w:before="0" w:after="0"/>
-              <w:jc w:val="start"/>
-            </w:pPr>
-            <w:r>
-              <w:rPr>
-                <w:rFonts w:ascii="Times New Roman" w:hAnsi="Times New Roman" w:cs="Times New Roman"/>
-                <w:sz w:val="20"/>
-                <w:szCs w:val="20"/>
-              </w:rPr>
-              <w:t xml:space="preserve">3.11.174</w:t>
-            </w:r>
-          </w:p>
-        </w:tc>
-        <w:tc>
-          <w:tcPr>
-            <w:tcW w:w="1800" w:type="dxa"/>
-            <w:tcBorders>
-              <w:top w:val="single" w:sz="4" w:space="0" w:color="000000"/>
-              <w:start w:val="single" w:sz="4" w:space="0" w:color="000000"/>
-              <w:bottom w:val="single" w:sz="4" w:space="0" w:color="000000"/>
-              <w:end w:val="single" w:sz="4" w:space="0" w:color="000000"/>
-            </w:tcBorders>
-          </w:tcPr>
-          <w:p>
-            <w:pPr>
-              <w:pStyle w:val="Normal"/>
-              <w:spacing w:lineRule="auto" w:line="240" w:before="0" w:after="0"/>
-              <w:jc w:val="start"/>
-            </w:pPr>
-            <w:r>
-              <w:rPr>
-                <w:rFonts w:ascii="Times New Roman" w:hAnsi="Times New Roman" w:cs="Times New Roman"/>
-                <w:sz w:val="20"/>
-                <w:szCs w:val="20"/>
-              </w:rPr>
-              <w:t xml:space="preserve">Apache-2.0</w:t>
-            </w:r>
-          </w:p>
-        </w:tc>
-        <w:tc>
-          <w:tcPr>
-            <w:tcW w:w="4200" w:type="dxa"/>
-            <w:tcBorders>
-              <w:top w:val="single" w:sz="4" w:space="0" w:color="000000"/>
-              <w:start w:val="single" w:sz="4" w:space="0" w:color="000000"/>
-              <w:bottom w:val="single" w:sz="4" w:space="0" w:color="000000"/>
-              <w:end w:val="single" w:sz="4" w:space="0" w:color="000000"/>
-            </w:tcBorders>
-          </w:tcPr>
-          <w:p>
-            <w:pPr>
-              <w:pStyle w:val="Normal"/>
-              <w:spacing w:lineRule="auto" w:line="240" w:before="0" w:after="0"/>
-              <w:jc w:val="start"/>
-            </w:pPr>
-            <w:r>
-              <w:rPr>
-                <w:rFonts w:ascii="Times New Roman" w:hAnsi="Times New Roman" w:cs="Times New Roman"/>
-                <w:sz w:val="20"/>
-                <w:szCs w:val="20"/>
-              </w:rPr>
-              <w:t xml:space="preserve">Извлечение текста из файлов формата PDF</w:t>
-            </w:r>
-          </w:p>
-        </w:tc>
-      </w:tr>
-    </w:tbl>
-    <w:p>
-      <w:pPr>
-        <w:pStyle w:val="Normal"/>
-        <w:ind w:firstLine="708"/>
-        <w:jc w:val="both"/>
-      </w:pPr>
-    </w:p>
-    <w:p>
-      <w:pPr>
-        <w:pStyle w:val="Normal"/>
-        <w:ind w:firstLine="708"/>
-        <w:jc w:val="both"/>
-      </w:pPr>
-      <w:r>
-        <w:rPr>
-          <w:rFonts w:ascii="Times New Roman" w:hAnsi="Times New Roman" w:cs="Times New Roman"/>
-          <w:sz w:val="24"/>
-          <w:szCs w:val="24"/>
-        </w:rPr>
-        <w:t xml:space="preserve">Оба компонента загружаются с внешней сети доставки содержимого cdnjs.cloudflare.com. При выборе условий MIT для JSZip обязательства ограничиваются сохранением уведомления об авторских правах.</w:t>
-      </w:r>
-    </w:p>
-    <w:p>
-      <w:pPr>
-        <w:pStyle w:val="Normal"/>
-        <w:spacing w:after="120"/>
-        <w:jc w:val="both"/>
-      </w:pPr>
-      <w:r>
-        <w:rPr>
-          <w:rFonts w:ascii="Times New Roman" w:hAnsi="Times New Roman" w:cs="Times New Roman"/>
-          <w:b/>
-          <w:bCs/>
-          <w:sz w:val="24"/>
-          <w:szCs w:val="24"/>
-        </w:rPr>
-        <w:t xml:space="preserve">6. Средства подготовки поставляемого учебного контента</w:t>
+        <w:t xml:space="preserve">5. Средства подготовки поставляемого учебного контента</w:t>
       </w:r>
     </w:p>
     <w:p>
@@ -9523,169 +9331,7 @@
                 <w:sz w:val="20"/>
                 <w:szCs w:val="20"/>
               </w:rPr>
-              <w:t xml:space="preserve">Синтез речи для французского, немецкого и китайского языков</w:t>
-            </w:r>
-          </w:p>
-        </w:tc>
-      </w:tr>
-      <w:tr>
-        <w:tc>
-          <w:tcPr>
-            <w:tcW w:w="2800" w:type="dxa"/>
-            <w:tcBorders>
-              <w:top w:val="single" w:sz="4" w:space="0" w:color="000000"/>
-              <w:start w:val="single" w:sz="4" w:space="0" w:color="000000"/>
-              <w:bottom w:val="single" w:sz="4" w:space="0" w:color="000000"/>
-              <w:end w:val="single" w:sz="4" w:space="0" w:color="000000"/>
-            </w:tcBorders>
-          </w:tcPr>
-          <w:p>
-            <w:pPr>
-              <w:pStyle w:val="Normal"/>
-              <w:spacing w:lineRule="auto" w:line="240" w:before="0" w:after="0"/>
-              <w:jc w:val="start"/>
-            </w:pPr>
-            <w:r>
-              <w:rPr>
-                <w:rFonts w:ascii="Times New Roman" w:hAnsi="Times New Roman" w:cs="Times New Roman"/>
-                <w:sz w:val="20"/>
-                <w:szCs w:val="20"/>
-              </w:rPr>
-              <w:t xml:space="preserve">PyTorch 2.14.0</w:t>
-            </w:r>
-          </w:p>
-        </w:tc>
-        <w:tc>
-          <w:tcPr>
-            <w:tcW w:w="3000" w:type="dxa"/>
-            <w:tcBorders>
-              <w:top w:val="single" w:sz="4" w:space="0" w:color="000000"/>
-              <w:start w:val="single" w:sz="4" w:space="0" w:color="000000"/>
-              <w:bottom w:val="single" w:sz="4" w:space="0" w:color="000000"/>
-              <w:end w:val="single" w:sz="4" w:space="0" w:color="000000"/>
-            </w:tcBorders>
-          </w:tcPr>
-          <w:p>
-            <w:pPr>
-              <w:pStyle w:val="Normal"/>
-              <w:spacing w:lineRule="auto" w:line="240" w:before="0" w:after="0"/>
-              <w:jc w:val="start"/>
-            </w:pPr>
-            <w:r>
-              <w:rPr>
-                <w:rFonts w:ascii="Times New Roman" w:hAnsi="Times New Roman" w:cs="Times New Roman"/>
-                <w:sz w:val="20"/>
-                <w:szCs w:val="20"/>
-              </w:rPr>
-              <w:t xml:space="preserve">BSD-3-Clause</w:t>
-            </w:r>
-          </w:p>
-        </w:tc>
-        <w:tc>
-          <w:tcPr>
-            <w:tcW w:w="4400" w:type="dxa"/>
-            <w:tcBorders>
-              <w:top w:val="single" w:sz="4" w:space="0" w:color="000000"/>
-              <w:start w:val="single" w:sz="4" w:space="0" w:color="000000"/>
-              <w:bottom w:val="single" w:sz="4" w:space="0" w:color="000000"/>
-              <w:end w:val="single" w:sz="4" w:space="0" w:color="000000"/>
-            </w:tcBorders>
-          </w:tcPr>
-          <w:p>
-            <w:pPr>
-              <w:pStyle w:val="Normal"/>
-              <w:spacing w:lineRule="auto" w:line="240" w:before="0" w:after="0"/>
-              <w:jc w:val="start"/>
-            </w:pPr>
-            <w:r>
-              <w:rPr>
-                <w:rFonts w:ascii="Times New Roman" w:hAnsi="Times New Roman" w:cs="Times New Roman"/>
-                <w:sz w:val="20"/>
-                <w:szCs w:val="20"/>
-              </w:rPr>
-              <w:t xml:space="preserve">Запуск модели синтеза речи</w:t>
-            </w:r>
-          </w:p>
-        </w:tc>
-      </w:tr>
-      <w:tr>
-        <w:tc>
-          <w:tcPr>
-            <w:tcW w:w="2800" w:type="dxa"/>
-            <w:tcBorders>
-              <w:top w:val="single" w:sz="4" w:space="0" w:color="000000"/>
-              <w:start w:val="single" w:sz="4" w:space="0" w:color="000000"/>
-              <w:bottom w:val="single" w:sz="4" w:space="0" w:color="000000"/>
-              <w:end w:val="single" w:sz="4" w:space="0" w:color="000000"/>
-            </w:tcBorders>
-          </w:tcPr>
-          <w:p>
-            <w:pPr>
-              <w:pStyle w:val="Normal"/>
-              <w:spacing w:lineRule="auto" w:line="240" w:before="0" w:after="0"/>
-              <w:jc w:val="start"/>
-            </w:pPr>
-            <w:r>
-              <w:rPr>
-                <w:rFonts w:ascii="Times New Roman" w:hAnsi="Times New Roman" w:cs="Times New Roman"/>
-                <w:sz w:val="20"/>
-                <w:szCs w:val="20"/>
-              </w:rPr>
-              <w:t xml:space="preserve">Silero TTS, модель ba/v2_aigul</w:t>
-            </w:r>
-          </w:p>
-        </w:tc>
-        <w:tc>
-          <w:tcPr>
-            <w:tcW w:w="3000" w:type="dxa"/>
-            <w:tcBorders>
-              <w:top w:val="single" w:sz="4" w:space="0" w:color="000000"/>
-              <w:start w:val="single" w:sz="4" w:space="0" w:color="000000"/>
-              <w:bottom w:val="single" w:sz="4" w:space="0" w:color="000000"/>
-              <w:end w:val="single" w:sz="4" w:space="0" w:color="000000"/>
-            </w:tcBorders>
-          </w:tcPr>
-          <w:p>
-            <w:pPr>
-              <w:pStyle w:val="Normal"/>
-              <w:spacing w:lineRule="auto" w:line="240" w:before="0" w:after="0"/>
-              <w:jc w:val="start"/>
-            </w:pPr>
-            <w:r>
-              <w:rPr>
-                <w:rFonts w:ascii="Times New Roman" w:hAnsi="Times New Roman" w:cs="Times New Roman"/>
-                <w:sz w:val="20"/>
-                <w:szCs w:val="20"/>
-                <w:highlight w:val="yellow"/>
-              </w:rPr>
-              <w:t xml:space="preserve">CC BY-NC-SA 4.0 — некоммерческая</w:t>
-            </w:r>
-          </w:p>
-        </w:tc>
-        <w:tc>
-          <w:tcPr>
-            <w:tcW w:w="4400" w:type="dxa"/>
-            <w:tcBorders>
-              <w:top w:val="single" w:sz="4" w:space="0" w:color="000000"/>
-              <w:start w:val="single" w:sz="4" w:space="0" w:color="000000"/>
-              <w:bottom w:val="single" w:sz="4" w:space="0" w:color="000000"/>
-              <w:end w:val="single" w:sz="4" w:space="0" w:color="000000"/>
-            </w:tcBorders>
-          </w:tcPr>
-          <w:p>
-            <w:pPr>
-              <w:pStyle w:val="Normal"/>
-              <w:spacing w:lineRule="auto" w:line="240" w:before="0" w:after="0"/>
-              <w:jc w:val="start"/>
-            </w:pPr>
-            <w:r>
-              <w:rPr>
-                <w:rFonts w:ascii="Times New Roman" w:hAnsi="Times New Roman" w:cs="Times New Roman"/>
-                <w:sz w:val="20"/>
-                <w:szCs w:val="20"/>
-                <w:highlight w:val="yellow"/>
-              </w:rPr>
-              <w:t xml:space="preserve">Синтез речи для башкирского языка. Условия лицензии не допускают коммерческого использования; вопрос требует решения до распространения продукта.</w:t>
+              <w:t xml:space="preserve">Синтез речи для башкирского, французского, немецкого и китайского языков</w:t>
             </w:r>
           </w:p>
         </w:tc>
@@ -9697,130 +9343,6 @@
         <w:ind w:firstLine="708"/>
         <w:jc w:val="both"/>
       </w:pPr>
-    </w:p>
-    <w:p>
-      <w:pPr>
-        <w:pStyle w:val="Normal"/>
-        <w:spacing w:after="120"/>
-        <w:jc w:val="both"/>
-      </w:pPr>
-      <w:r>
-        <w:rPr>
-          <w:rFonts w:ascii="Times New Roman" w:hAnsi="Times New Roman" w:cs="Times New Roman"/>
-          <w:b/>
-          <w:bCs/>
-          <w:sz w:val="24"/>
-          <w:szCs w:val="24"/>
-        </w:rPr>
-        <w:t xml:space="preserve">7. Открытые вопросы, требующие решения правообладателя</w:t>
-      </w:r>
-    </w:p>
-    <w:p>
-      <w:pPr>
-        <w:pStyle w:val="Normal"/>
-        <w:ind w:firstLine="708"/>
-        <w:jc w:val="both"/>
-      </w:pPr>
-      <w:r>
-        <w:rPr>
-          <w:rFonts w:ascii="Times New Roman" w:hAnsi="Times New Roman" w:cs="Times New Roman"/>
-          <w:i/>
-          <w:iCs/>
-          <w:sz w:val="24"/>
-          <w:szCs w:val="24"/>
-        </w:rPr>
-        <w:t xml:space="preserve">Раздел носит служебный характер и отражает состояние на дату составления перечня.</w:t>
-      </w:r>
-    </w:p>
-    <w:p>
-      <w:pPr>
-        <w:pStyle w:val="ListParagraph"/>
-        <w:numPr>
-          <w:ilvl w:val="0"/>
-          <w:numId w:val="1"/>
-        </w:numPr>
-        <w:jc w:val="both"/>
-      </w:pPr>
-      <w:r>
-        <w:rPr>
-          <w:rFonts w:ascii="Times New Roman" w:hAnsi="Times New Roman" w:cs="Times New Roman"/>
-          <w:sz w:val="24"/>
-          <w:szCs w:val="24"/>
-        </w:rPr>
-        <w:t xml:space="preserve">Модель синтеза речи Silero (башкирская озвучка виджета «Инофон») распространяется на условиях CC BY-NC-SA 4.0, не допускающих коммерческого использования. Возможные решения: возврат к синтезу средствами eSpeak NG (сохранённые файлы озвучки имеются) либо приобретение коммерческой лицензии.</w:t>
-      </w:r>
-    </w:p>
-    <w:p>
-      <w:pPr>
-        <w:pStyle w:val="ListParagraph"/>
-        <w:numPr>
-          <w:ilvl w:val="0"/>
-          <w:numId w:val="1"/>
-        </w:numPr>
-        <w:jc w:val="both"/>
-      </w:pPr>
-      <w:r>
-        <w:rPr>
-          <w:rFonts w:ascii="Times New Roman" w:hAnsi="Times New Roman" w:cs="Times New Roman"/>
-          <w:sz w:val="24"/>
-          <w:szCs w:val="24"/>
-        </w:rPr>
-        <w:t xml:space="preserve">Речь на русском и английском языках синтезирована голосами, поставляемыми в составе операционной системы Windows. Условия их использования в распространяемом продукте регулируются лицензией на операционную систему и требуют правовой оценки.</w:t>
-      </w:r>
-    </w:p>
-    <w:p>
-      <w:pPr>
-        <w:pStyle w:val="ListParagraph"/>
-        <w:numPr>
-          <w:ilvl w:val="0"/>
-          <w:numId w:val="1"/>
-        </w:numPr>
-        <w:jc w:val="both"/>
-      </w:pPr>
-      <w:r>
-        <w:rPr>
-          <w:rFonts w:ascii="Times New Roman" w:hAnsi="Times New Roman" w:cs="Times New Roman"/>
-          <w:sz w:val="24"/>
-          <w:szCs w:val="24"/>
-        </w:rPr>
-        <w:t xml:space="preserve">Компоненты JSZip и PDF.js загружаются во время работы с зарубежной сети доставки содержимого. Помимо лицензионной стороны это создаёт зависимость от внешнего сервиса; целесообразно включить оба компонента в состав поставки.</w:t>
-      </w:r>
-    </w:p>
-    <w:p>
-      <w:pPr>
-        <w:pStyle w:val="ListParagraph"/>
-        <w:numPr>
-          <w:ilvl w:val="0"/>
-          <w:numId w:val="1"/>
-        </w:numPr>
-        <w:jc w:val="both"/>
-      </w:pPr>
-      <w:r>
-        <w:rPr>
-          <w:rFonts w:ascii="Times New Roman" w:hAnsi="Times New Roman" w:cs="Times New Roman"/>
-          <w:sz w:val="24"/>
-          <w:szCs w:val="24"/>
-        </w:rPr>
-        <w:t xml:space="preserve">Часть поставляемых иллюстраций создана генеративными моделями, часть звукозаписей синтезирована. Правовой статус таких материалов требует оценки; реестр источников по каждому материалу контента не заведён.</w:t>
-      </w:r>
-    </w:p>
-    <w:p>
-      <w:pPr>
-        <w:pStyle w:val="ListParagraph"/>
-        <w:numPr>
-          <w:ilvl w:val="0"/>
-          <w:numId w:val="1"/>
-        </w:numPr>
-        <w:jc w:val="both"/>
-      </w:pPr>
-      <w:r>
-        <w:rPr>
-          <w:rFonts w:ascii="Times New Roman" w:hAnsi="Times New Roman" w:cs="Times New Roman"/>
-          <w:sz w:val="24"/>
-          <w:szCs w:val="24"/>
-        </w:rPr>
-        <w:t xml:space="preserve">Необходимо убедиться, что файл с текстами лицензий зависимостей включён в собранный дистрибутив: этого требуют лицензии MIT, BSD и Apache-2.0.</w:t>
-      </w:r>
     </w:p>
     <w:sectPr>
       <w:type w:val="nextPage"/>

</xml_diff>